<commit_message>
DOCS : Exercices Correction d'algo ajouté
</commit_message>
<xml_diff>
--- a/Exercices de correction d'algo/Exercices Correction.docx
+++ b/Exercices de correction d'algo/Exercices Correction.docx
@@ -17,10 +17,7 @@
     </w:p>
     <w:p>
       <w:r>
-        <w:t>Il manquait &gt;= dans l’algorithme donné ce qui cause problème si l’</w:t>
-      </w:r>
-      <w:r>
-        <w:t>utilisateur a 18 ans pile.</w:t>
+        <w:t>Il manquait &gt;= dans l’algorithme donné ce qui cause problème si l’utilisateur a 18 ans pile.</w:t>
       </w:r>
     </w:p>
     <w:p>
@@ -158,7 +155,17 @@
     </w:p>
     <w:p>
       <w:r>
-        <w:t>SINON AFFICHER « Non-Admis »</w:t>
+        <w:t xml:space="preserve">SINON </w:t>
+      </w:r>
+    </w:p>
+    <w:p>
+      <w:pPr>
+        <w:ind w:firstLine="708"/>
+      </w:pPr>
+      <w:bookmarkStart w:id="0" w:name="_GoBack"/>
+      <w:bookmarkEnd w:id="0"/>
+      <w:r>
+        <w:t>AFFICHER « Non-Admis »</w:t>
       </w:r>
     </w:p>
     <w:p>
@@ -184,8 +191,6 @@
         <w:lastRenderedPageBreak/>
         <w:t xml:space="preserve">Exercice 4 : </w:t>
       </w:r>
-      <w:bookmarkStart w:id="0" w:name="_GoBack"/>
-      <w:bookmarkEnd w:id="0"/>
     </w:p>
     <w:p>
       <w:r>

</xml_diff>

<commit_message>
DOCS : modifs exercice tableau multidimensionnel
</commit_message>
<xml_diff>
--- a/Exercices de correction d'algo/Exercices Correction.docx
+++ b/Exercices de correction d'algo/Exercices Correction.docx
@@ -162,8 +162,6 @@
       <w:pPr>
         <w:ind w:firstLine="708"/>
       </w:pPr>
-      <w:bookmarkStart w:id="0" w:name="_GoBack"/>
-      <w:bookmarkEnd w:id="0"/>
       <w:r>
         <w:t>AFFICHER « Non-Admis »</w:t>
       </w:r>
@@ -194,13 +192,16 @@
     </w:p>
     <w:p>
       <w:r>
-        <w:t xml:space="preserve">Notes &lt;- </w:t>
-      </w:r>
-      <w:proofErr w:type="gramStart"/>
-      <w:r>
-        <w:t>[ ]</w:t>
-      </w:r>
-      <w:proofErr w:type="gramEnd"/>
+        <w:t>Notes &lt;- [</w:t>
+      </w:r>
+      <w:r>
+        <w:t>0</w:t>
+      </w:r>
+      <w:bookmarkStart w:id="0" w:name="_GoBack"/>
+      <w:bookmarkEnd w:id="0"/>
+      <w:r>
+        <w:t>]</w:t>
+      </w:r>
     </w:p>
     <w:p>
       <w:r>

</xml_diff>